<commit_message>
feat: publish Context Engineering book section and refresh project cards
Add a dedicated Book section for "Context Engineering: Designing AI That
Understands, Remembers, Acts, and Learns" (release candidate v1.0.0-rc1),
including the cover image, a new nav entry, and book data.

Refresh the project cards to match the current estate: terraphim.rs,
Terraphim Forge, terraphim-skills.md, Autonomous Delivery Factory,
Digital Synthetic Twins, The Pattern, Blockchain-Inspired Distributed
System, Terraphim AgentForge, Terraphim Skills, and Time Agent.

Keep TruthForge off the cards and llms.txt until the PFA gate passes.
Keep Cadro and Charm off the public site.

Refresh the CV artefacts and update the published llms.txt.

Deployed to the metacortex-engineer R2 bucket: 96 files uploaded.
Verified live at https://metacortex.engineer: 11 cards, the Book
section with the correct title and status, 9 nav items, the cover
loading at 800x1280, and no horizontal overflow at 390px or 1440px.
</commit_message>
<xml_diff>
--- a/astro-site/public/media/Alex M CS_for_NGI.docx
+++ b/astro-site/public/media/Alex M CS_for_NGI.docx
@@ -2857,15 +2857,15 @@
           <w:rFonts w:cs="Calibri" w:asciiTheme="minorHAnsi" w:hAnsiTheme="minorHAnsi"/>
           <w:sz w:val="20"/>
         </w:rPr>
-        <w:t>Cranfield Defence and Security (CDS) is based at the Ministry of Defence establishment on the Oxfordshire/Wiltshire border</w:t>
-      </w:r>
-      <w:r>
-        <w:rPr>
-          <w:rFonts w:cs="Calibri" w:asciiTheme="minorHAnsi" w:hAnsiTheme="minorHAnsi"/>
-          <w:sz w:val="20"/>
-          <w:lang w:val="en-US"/>
-        </w:rPr>
-        <w:t>s. It is a specialist postgraduate university with a strong research community. During my tenure at Cranfield University I successfully delivered innovation projects sponsored by General Dynamics UK, Boeing and Rolls Royce UK.</w:t>
+        <w:t/>
+      </w:r>
+      <w:r>
+        <w:rPr>
+          <w:rFonts w:cs="Calibri" w:asciiTheme="minorHAnsi" w:hAnsiTheme="minorHAnsi"/>
+          <w:sz w:val="20"/>
+          <w:lang w:val="en-US"/>
+        </w:rPr>
+        <w:t>It is a specialist postgraduate university with a strong research community. During my tenure at Cranfield University I successfully delivered innovation projects sponsored by General Dynamics UK, Boeing and Rolls Royce UK.</w:t>
       </w:r>
     </w:p>
     <w:p>

</xml_diff>